<commit_message>
Remove table of contents from final report
</commit_message>
<xml_diff>
--- a/reports/TOY-Banking-SYSTEM-final-report.docx
+++ b/reports/TOY-Banking-SYSTEM-final-report.docx
@@ -38,64 +38,6 @@
     <w:p>
       <w:r>
         <w:t>이체는 송금 계좌에서 돈을 빼는 기존 기능이며 수취 계좌에 입금하지 않는다. 작업 내역은 현재 로그인 세션의 메모리에만 남는다. 표준 C 파일 이름 변경을 여러 번 사용하므로 저장 전체의 원자성이나 정전 시 복구를 보장하지는 않는다.</w:t>
-      </w:r>
-    </w:p>
-    <w:p>
-      <w:pPr>
-        <w:pStyle w:val="Heading2"/>
-      </w:pPr>
-      <w:r>
-        <w:t>목차</w:t>
-      </w:r>
-    </w:p>
-    <w:p>
-      <w:r>
-        <w:t>1 프로그램 개발 목적 및 개요</w:t>
-      </w:r>
-    </w:p>
-    <w:p>
-      <w:r>
-        <w:t>2 프로그램 요구사항</w:t>
-      </w:r>
-    </w:p>
-    <w:p>
-      <w:r>
-        <w:t>3 프로그램 주요 기능</w:t>
-      </w:r>
-    </w:p>
-    <w:p>
-      <w:r>
-        <w:t>4 프로그램 구조 및 자료흐름도</w:t>
-      </w:r>
-    </w:p>
-    <w:p>
-      <w:r>
-        <w:t>5 주요 소스 코드 및 함수 설명</w:t>
-      </w:r>
-    </w:p>
-    <w:p>
-      <w:r>
-        <w:t>6 파일 입출력 기능 구현</w:t>
-      </w:r>
-    </w:p>
-    <w:p>
-      <w:r>
-        <w:t>7 테스트 케이스 및 검증 과정</w:t>
-      </w:r>
-    </w:p>
-    <w:p>
-      <w:r>
-        <w:t>8 실제 프로그램 실행 결과</w:t>
-      </w:r>
-    </w:p>
-    <w:p>
-      <w:r>
-        <w:t>9 오류 원인과 해결 과정</w:t>
-      </w:r>
-    </w:p>
-    <w:p>
-      <w:r>
-        <w:t>10 결론 및 향후 개선 방향</w:t>
       </w:r>
     </w:p>
     <w:p>

</xml_diff>